<commit_message>
Ship Olakha Cedar public redesign so Pelbu no longer matches the old Sky template.
Rebuild header/mega/footer/home shells with cedar tokens, mobile mega + booking dock, and keep BAFRA manuals/forms updates in the same ship.

Co-authored-by: Cursor <cursoragent@cursor.com>
</commit_message>
<xml_diff>
--- a/docs/bafra-compliance/05-FB-Service-Restaurant-Cafe-Bar-BAFRA-Compliance.docx
+++ b/docs/bafra-compliance/05-FB-Service-Restaurant-Cafe-Bar-BAFRA-Compliance.docx
@@ -276,7 +276,48 @@
           <w:bCs/>
           <w:color w:val="6B2D3C"/>
         </w:rPr>
-        <w:t xml:space="preserve">3. SOP 01 — Personal Hygiene (Service staff)</w:t>
+        <w:t xml:space="preserve">3. SOP 01 — Personal Hygiene Policy (Service staff)</w:t>
+      </w:r>
+    </w:p>
+    <w:p>
+      <w:pPr>
+        <w:pStyle w:val="Heading2"/>
+        <w:spacing w:after="120" w:before="200"/>
+      </w:pPr>
+      <w:r>
+        <w:rPr>
+          <w:b/>
+          <w:bCs/>
+          <w:color w:val="2C1810"/>
+        </w:rPr>
+        <w:t xml:space="preserve">Objective</w:t>
+      </w:r>
+    </w:p>
+    <w:p>
+      <w:pPr>
+        <w:spacing w:after="120"/>
+      </w:pPr>
+      <w:r>
+        <w:rPr>
+          <w:color w:val="2C1810"/>
+          <w:sz w:val="22"/>
+          <w:szCs w:val="22"/>
+        </w:rPr>
+        <w:t xml:space="preserve">Prevent guest-facing contamination from restaurant, café, and bar staff.</w:t>
+      </w:r>
+    </w:p>
+    <w:p>
+      <w:pPr>
+        <w:pStyle w:val="Heading2"/>
+        <w:spacing w:after="120" w:before="200"/>
+      </w:pPr>
+      <w:r>
+        <w:rPr>
+          <w:b/>
+          <w:bCs/>
+          <w:color w:val="2C1810"/>
+        </w:rPr>
+        <w:t xml:space="preserve">Uniform &amp; appearance</w:t>
       </w:r>
     </w:p>
     <w:p>
@@ -294,7 +335,7 @@
           <w:sz w:val="22"/>
           <w:szCs w:val="22"/>
         </w:rPr>
-        <w:t xml:space="preserve">Clean uniform, hair restrained, closed-toe shoes.</w:t>
+        <w:t xml:space="preserve">Clean outlet uniform; change if soiled.</w:t>
       </w:r>
     </w:p>
     <w:p>
@@ -312,7 +353,7 @@
           <w:sz w:val="22"/>
           <w:szCs w:val="22"/>
         </w:rPr>
-        <w:t xml:space="preserve">Handwash before service, after clearing soiled plates, after restroom, after handling waste.</w:t>
+        <w:t xml:space="preserve">Hair restrained (tied back / covered as outlet standard); closed-toe shoes.</w:t>
       </w:r>
     </w:p>
     <w:p>
@@ -330,7 +371,207 @@
           <w:sz w:val="22"/>
           <w:szCs w:val="22"/>
         </w:rPr>
-        <w:t xml:space="preserve">No jewellery that contacts food; report illness immediately.</w:t>
+        <w:t xml:space="preserve">Fingernails short and clean; no artificial nails when plating or handling open food.</w:t>
+      </w:r>
+    </w:p>
+    <w:p>
+      <w:pPr>
+        <w:pStyle w:val="Heading2"/>
+        <w:spacing w:after="120" w:before="200"/>
+      </w:pPr>
+      <w:r>
+        <w:rPr>
+          <w:b/>
+          <w:bCs/>
+          <w:color w:val="2C1810"/>
+        </w:rPr>
+        <w:t xml:space="preserve">Jewellery</w:t>
+      </w:r>
+    </w:p>
+    <w:p>
+      <w:pPr>
+        <w:pStyle w:val="ListParagraph"/>
+        <w:numPr>
+          <w:ilvl w:val="0"/>
+          <w:numId w:val="3"/>
+        </w:numPr>
+        <w:spacing w:after="60"/>
+      </w:pPr>
+      <w:r>
+        <w:rPr>
+          <w:color w:val="2C1810"/>
+          <w:sz w:val="22"/>
+          <w:szCs w:val="22"/>
+        </w:rPr>
+        <w:t xml:space="preserve">No jewellery that contacts food or drink; remove before plating, garnishing, or clearing soiled ware into food areas.</w:t>
+      </w:r>
+    </w:p>
+    <w:p>
+      <w:pPr>
+        <w:pStyle w:val="Heading2"/>
+        <w:spacing w:after="120" w:before="200"/>
+      </w:pPr>
+      <w:r>
+        <w:rPr>
+          <w:b/>
+          <w:bCs/>
+          <w:color w:val="2C1810"/>
+        </w:rPr>
+        <w:t xml:space="preserve">Handwashing</w:t>
+      </w:r>
+    </w:p>
+    <w:p>
+      <w:pPr>
+        <w:pStyle w:val="ListParagraph"/>
+        <w:numPr>
+          <w:ilvl w:val="0"/>
+          <w:numId w:val="3"/>
+        </w:numPr>
+        <w:spacing w:after="60"/>
+      </w:pPr>
+      <w:r>
+        <w:rPr>
+          <w:color w:val="2C1810"/>
+          <w:sz w:val="22"/>
+          <w:szCs w:val="22"/>
+        </w:rPr>
+        <w:t xml:space="preserve">Wash hands ≥ 20 seconds with soap before service, after clearing soiled plates, after restroom, after handling waste or money, and before returning to guest food.</w:t>
+      </w:r>
+    </w:p>
+    <w:p>
+      <w:pPr>
+        <w:pStyle w:val="ListParagraph"/>
+        <w:numPr>
+          <w:ilvl w:val="0"/>
+          <w:numId w:val="3"/>
+        </w:numPr>
+        <w:spacing w:after="60"/>
+      </w:pPr>
+      <w:r>
+        <w:rPr>
+          <w:color w:val="2C1810"/>
+          <w:sz w:val="22"/>
+          <w:szCs w:val="22"/>
+        </w:rPr>
+        <w:t xml:space="preserve">Dry with single-use towels; do not wipe hands on apron or cloths used for tables.</w:t>
+      </w:r>
+    </w:p>
+    <w:p>
+      <w:pPr>
+        <w:pStyle w:val="Heading2"/>
+        <w:spacing w:after="120" w:before="200"/>
+      </w:pPr>
+      <w:r>
+        <w:rPr>
+          <w:b/>
+          <w:bCs/>
+          <w:color w:val="2C1810"/>
+        </w:rPr>
+        <w:t xml:space="preserve">Illness</w:t>
+      </w:r>
+    </w:p>
+    <w:p>
+      <w:pPr>
+        <w:pStyle w:val="ListParagraph"/>
+        <w:numPr>
+          <w:ilvl w:val="0"/>
+          <w:numId w:val="3"/>
+        </w:numPr>
+        <w:spacing w:after="60"/>
+      </w:pPr>
+      <w:r>
+        <w:rPr>
+          <w:color w:val="2C1810"/>
+          <w:sz w:val="22"/>
+          <w:szCs w:val="22"/>
+        </w:rPr>
+        <w:t xml:space="preserve">Report fever, diarrhoea, vomiting, open infected wounds, or respiratory infection immediately — do not serve food until cleared / reassigned.</w:t>
+      </w:r>
+    </w:p>
+    <w:p>
+      <w:pPr>
+        <w:pStyle w:val="ListParagraph"/>
+        <w:numPr>
+          <w:ilvl w:val="0"/>
+          <w:numId w:val="3"/>
+        </w:numPr>
+        <w:spacing w:after="60"/>
+      </w:pPr>
+      <w:r>
+        <w:rPr>
+          <w:color w:val="2C1810"/>
+          <w:sz w:val="22"/>
+          <w:szCs w:val="22"/>
+        </w:rPr>
+        <w:t xml:space="preserve">Cuts: waterproof plaster + glove when handling food or drinkware.</w:t>
+      </w:r>
+    </w:p>
+    <w:p>
+      <w:pPr>
+        <w:pStyle w:val="Heading2"/>
+        <w:spacing w:after="120" w:before="200"/>
+      </w:pPr>
+      <w:r>
+        <w:rPr>
+          <w:b/>
+          <w:bCs/>
+          <w:color w:val="2C1810"/>
+        </w:rPr>
+        <w:t xml:space="preserve">Service behaviour</w:t>
+      </w:r>
+    </w:p>
+    <w:p>
+      <w:pPr>
+        <w:pStyle w:val="ListParagraph"/>
+        <w:numPr>
+          <w:ilvl w:val="0"/>
+          <w:numId w:val="3"/>
+        </w:numPr>
+        <w:spacing w:after="60"/>
+      </w:pPr>
+      <w:r>
+        <w:rPr>
+          <w:color w:val="2C1810"/>
+          <w:sz w:val="22"/>
+          <w:szCs w:val="22"/>
+        </w:rPr>
+        <w:t xml:space="preserve">No smoking, gum, or eating at guest stations or pass.</w:t>
+      </w:r>
+    </w:p>
+    <w:p>
+      <w:pPr>
+        <w:pStyle w:val="ListParagraph"/>
+        <w:numPr>
+          <w:ilvl w:val="0"/>
+          <w:numId w:val="3"/>
+        </w:numPr>
+        <w:spacing w:after="60"/>
+      </w:pPr>
+      <w:r>
+        <w:rPr>
+          <w:color w:val="2C1810"/>
+          <w:sz w:val="22"/>
+          <w:szCs w:val="22"/>
+        </w:rPr>
+        <w:t xml:space="preserve">Do not taste guest drinks/food with used glassware or shared spoons.</w:t>
+      </w:r>
+    </w:p>
+    <w:p>
+      <w:pPr>
+        <w:pStyle w:val="ListParagraph"/>
+        <w:numPr>
+          <w:ilvl w:val="0"/>
+          <w:numId w:val="3"/>
+        </w:numPr>
+        <w:spacing w:after="60"/>
+      </w:pPr>
+      <w:r>
+        <w:rPr>
+          <w:color w:val="2C1810"/>
+          <w:sz w:val="22"/>
+          <w:szCs w:val="22"/>
+        </w:rPr>
+        <w:t xml:space="preserve">Cover coughs/sneezes; wash hands before returning to service.</w:t>
       </w:r>
     </w:p>
     <w:p>

</xml_diff>